<commit_message>
Add 10 incident scenarios with professional DevOps response to the Word doc
Covers CrashLoopBackOff, PVC pending, ImagePullBackOff, CI/CD loop,
leaked secrets, rolling-update downtime, migration races, VNPay
signature mismatch, cluster restart resilience, and ArgoCD/HPA
field ownership conflicts — each with symptom, root cause, fix,
and rationale.

Co-Authored-By: Claude Sonnet 5 <noreply@anthropic.com>
</commit_message>
<xml_diff>
--- a/docs/MocStore-DevOps.docx
+++ b/docs/MocStore-DevOps.docx
@@ -2849,12 +2849,1119 @@
       </w:r>
     </w:p>
     <w:p>
+      <w:r>
+        <w:br w:type="page"/>
+      </w:r>
+    </w:p>
+    <w:p>
       <w:pPr>
         <w:pStyle w:val="Heading1"/>
         <w:spacing w:after="200" w:before="400"/>
       </w:pPr>
       <w:r>
-        <w:t xml:space="preserve">8. Thông tin truy cập nhanh</w:t>
+        <w:t xml:space="preserve">8. 10 tình huống sự cố giả định &amp; cách xử lý chuyên nghiệp</w:t>
+      </w:r>
+    </w:p>
+    <w:p>
+      <w:pPr>
+        <w:spacing w:after="160"/>
+      </w:pPr>
+      <w:r>
+        <w:t xml:space="preserve">Phần này mô phỏng 10 sự cố có thể thực sự xảy ra trên chính hệ thống Mộc Store, dựa trên đúng các thành phần đã triển khai (Kubernetes, ArgoCD, GitHub Actions, Docker Hub, VNPay). Mỗi tình huống trình bày theo cấu trúc mà một DevOps Engineer dùng để xử lý sự cố thực tế: nhận diện triệu chứng, xác định nguyên nhân gốc (root cause), hành động khắc phục, và quan trọng nhất — lý do đằng sau hành động đó, vì xử lý đúng cách luôn quan trọng hơn xử lý cho nhanh.</w:t>
+      </w:r>
+    </w:p>
+    <w:p>
+      <w:pPr>
+        <w:pStyle w:val="Heading2"/>
+        <w:spacing w:after="120" w:before="300"/>
+      </w:pPr>
+      <w:r>
+        <w:rPr>
+          <w:b/>
+          <w:bCs/>
+          <w:color w:val="C97F12"/>
+          <w:sz w:val="26"/>
+          <w:szCs w:val="26"/>
+        </w:rPr>
+        <w:t xml:space="preserve">Tình huống 1: Backend rơi vào CrashLoopBackOff sau khi sửa Secret database</w:t>
+      </w:r>
+    </w:p>
+    <w:p>
+      <w:pPr>
+        <w:spacing w:after="100"/>
+        <w:ind w:left="200"/>
+      </w:pPr>
+      <w:r>
+        <w:rPr>
+          <w:b/>
+          <w:bCs/>
+          <w:color w:val="1F5E46"/>
+          <w:sz w:val="21"/>
+          <w:szCs w:val="21"/>
+        </w:rPr>
+        <w:t xml:space="preserve">Triệu chứng: </w:t>
+      </w:r>
+      <w:r>
+        <w:rPr>
+          <w:sz w:val="21"/>
+          <w:szCs w:val="21"/>
+        </w:rPr>
+        <w:t xml:space="preserve">kubectl get pods -n ecommerce cho thấy Pod backend liên tục Restart, trạng thái CrashLoopBackOff.</w:t>
+      </w:r>
+    </w:p>
+    <w:p>
+      <w:pPr>
+        <w:spacing w:after="100"/>
+        <w:ind w:left="200"/>
+      </w:pPr>
+      <w:r>
+        <w:rPr>
+          <w:b/>
+          <w:bCs/>
+          <w:color w:val="1F5E46"/>
+          <w:sz w:val="21"/>
+          <w:szCs w:val="21"/>
+        </w:rPr>
+        <w:t xml:space="preserve">Nguyên nhân: </w:t>
+      </w:r>
+      <w:r>
+        <w:rPr>
+          <w:sz w:val="21"/>
+          <w:szCs w:val="21"/>
+        </w:rPr>
+        <w:t xml:space="preserve">Sau khi cập nhật DATABASE_URL trong Secret (đổi mật khẩu Postgres) nhưng gõ sai mật khẩu, Prisma báo lỗi kết nối ngay khi container khởi động nên process thoát, Kubernetes restart rồi lại lỗi, lặp vô hạn.</w:t>
+      </w:r>
+    </w:p>
+    <w:p>
+      <w:pPr>
+        <w:spacing w:after="100"/>
+        <w:ind w:left="200"/>
+      </w:pPr>
+      <w:r>
+        <w:rPr>
+          <w:b/>
+          <w:bCs/>
+          <w:color w:val="1F5E46"/>
+          <w:sz w:val="21"/>
+          <w:szCs w:val="21"/>
+        </w:rPr>
+        <w:t xml:space="preserve">Cách xử lý chuyên nghiệp: </w:t>
+      </w:r>
+      <w:r>
+        <w:rPr>
+          <w:sz w:val="21"/>
+          <w:szCs w:val="21"/>
+        </w:rPr>
+        <w:t xml:space="preserve">Xem log gốc bằng kubectl logs -n ecommerce &lt;pod&gt; --previous để thấy lỗi thật (không phải lỗi restart); sửa lại đúng giá trị Secret; nếu cần khôi phục ngay lập tức trong lúc chưa tìm ra nguyên nhân, dùng kubectl rollout undo deployment/backend -n ecommerce để quay về bản trước đó đã biết là chạy ổn.</w:t>
+      </w:r>
+    </w:p>
+    <w:p>
+      <w:pPr>
+        <w:spacing w:after="100"/>
+        <w:ind w:left="200"/>
+      </w:pPr>
+      <w:r>
+        <w:rPr>
+          <w:b/>
+          <w:bCs/>
+          <w:color w:val="1F5E46"/>
+          <w:sz w:val="21"/>
+          <w:szCs w:val="21"/>
+        </w:rPr>
+        <w:t xml:space="preserve">Vì sao phải xử lý như vậy: </w:t>
+      </w:r>
+      <w:r>
+        <w:rPr>
+          <w:sz w:val="21"/>
+          <w:szCs w:val="21"/>
+        </w:rPr>
+        <w:t xml:space="preserve">Ưu tiên khôi phục dịch vụ trước, điều tra nguyên nhân sau ('restore service first, root-cause later') — trong lúc production đang down, thời gian debug tại chỗ tốn kém hơn nhiều so với rollback về trạng thái đã được xác nhận hoạt động, vốn luôn sẵn có nhờ lịch sử rollout của Deployment.</w:t>
+      </w:r>
+    </w:p>
+    <w:p>
+      <w:pPr>
+        <w:pStyle w:val="Heading2"/>
+        <w:spacing w:after="120" w:before="300"/>
+      </w:pPr>
+      <w:r>
+        <w:rPr>
+          <w:b/>
+          <w:bCs/>
+          <w:color w:val="C97F12"/>
+          <w:sz w:val="26"/>
+          <w:szCs w:val="26"/>
+        </w:rPr>
+        <w:t xml:space="preserve">Tình huống 2: PVC của PostgreSQL ở trạng thái Pending, Pod postgres-0 không khởi động được</w:t>
+      </w:r>
+    </w:p>
+    <w:p>
+      <w:pPr>
+        <w:spacing w:after="100"/>
+        <w:ind w:left="200"/>
+      </w:pPr>
+      <w:r>
+        <w:rPr>
+          <w:b/>
+          <w:bCs/>
+          <w:color w:val="1F5E46"/>
+          <w:sz w:val="21"/>
+          <w:szCs w:val="21"/>
+        </w:rPr>
+        <w:t xml:space="preserve">Triệu chứng: </w:t>
+      </w:r>
+      <w:r>
+        <w:rPr>
+          <w:sz w:val="21"/>
+          <w:szCs w:val="21"/>
+        </w:rPr>
+        <w:t xml:space="preserve">postgres-0 kẹt ở Pending; kubectl describe pvc postgres-data-postgres-0 -n ecommerce báo 'no persistent volumes available for this claim'.</w:t>
+      </w:r>
+    </w:p>
+    <w:p>
+      <w:pPr>
+        <w:spacing w:after="100"/>
+        <w:ind w:left="200"/>
+      </w:pPr>
+      <w:r>
+        <w:rPr>
+          <w:b/>
+          <w:bCs/>
+          <w:color w:val="1F5E46"/>
+          <w:sz w:val="21"/>
+          <w:szCs w:val="21"/>
+        </w:rPr>
+        <w:t xml:space="preserve">Nguyên nhân: </w:t>
+      </w:r>
+      <w:r>
+        <w:rPr>
+          <w:sz w:val="21"/>
+          <w:szCs w:val="21"/>
+        </w:rPr>
+        <w:t xml:space="preserve">StorageClass khai báo trong volumeClaimTemplates sai tên (không khớp StorageClass thật của cluster), hoặc dung lượng yêu cầu vượt quá khả năng cấp phát của provisioner.</w:t>
+      </w:r>
+    </w:p>
+    <w:p>
+      <w:pPr>
+        <w:spacing w:after="100"/>
+        <w:ind w:left="200"/>
+      </w:pPr>
+      <w:r>
+        <w:rPr>
+          <w:b/>
+          <w:bCs/>
+          <w:color w:val="1F5E46"/>
+          <w:sz w:val="21"/>
+          <w:szCs w:val="21"/>
+        </w:rPr>
+        <w:t xml:space="preserve">Cách xử lý chuyên nghiệp: </w:t>
+      </w:r>
+      <w:r>
+        <w:rPr>
+          <w:sz w:val="21"/>
+          <w:szCs w:val="21"/>
+        </w:rPr>
+        <w:t xml:space="preserve">Kiểm tra kubectl get storageclass để lấy đúng tên; sửa lại storageClassName trong manifest StatefulSet; áp dụng lại. Tuyệt đối không vội kubectl delete pvc để 'làm lại từ đầu' vì PVC đang giữ dữ liệu thật của Postgres.</w:t>
+      </w:r>
+    </w:p>
+    <w:p>
+      <w:pPr>
+        <w:spacing w:after="100"/>
+        <w:ind w:left="200"/>
+      </w:pPr>
+      <w:r>
+        <w:rPr>
+          <w:b/>
+          <w:bCs/>
+          <w:color w:val="1F5E46"/>
+          <w:sz w:val="21"/>
+          <w:szCs w:val="21"/>
+        </w:rPr>
+        <w:t xml:space="preserve">Vì sao phải xử lý như vậy: </w:t>
+      </w:r>
+      <w:r>
+        <w:rPr>
+          <w:sz w:val="21"/>
+          <w:szCs w:val="21"/>
+        </w:rPr>
+        <w:t xml:space="preserve">PVC gắn liền vòng đời dữ liệu, không gắn liền vòng đời Pod — xóa nhầm PVC là một trong những nguyên nhân mất dữ liệu vĩnh viễn phổ biến nhất khi vận hành Kubernetes; nguyên tắc an toàn là luôn chọn hành động có thể đảo ngược trước, hành động phá hủy chỉ thực hiện khi đã chắc chắn 100%.</w:t>
+      </w:r>
+    </w:p>
+    <w:p>
+      <w:pPr>
+        <w:pStyle w:val="Heading2"/>
+        <w:spacing w:after="120" w:before="300"/>
+      </w:pPr>
+      <w:r>
+        <w:rPr>
+          <w:b/>
+          <w:bCs/>
+          <w:color w:val="C97F12"/>
+          <w:sz w:val="26"/>
+          <w:szCs w:val="26"/>
+        </w:rPr>
+        <w:t xml:space="preserve">Tình huống 3: Pod báo ImagePullBackOff sau khi CI/CD vừa chạy xong</w:t>
+      </w:r>
+    </w:p>
+    <w:p>
+      <w:pPr>
+        <w:spacing w:after="100"/>
+        <w:ind w:left="200"/>
+      </w:pPr>
+      <w:r>
+        <w:rPr>
+          <w:b/>
+          <w:bCs/>
+          <w:color w:val="1F5E46"/>
+          <w:sz w:val="21"/>
+          <w:szCs w:val="21"/>
+        </w:rPr>
+        <w:t xml:space="preserve">Triệu chứng: </w:t>
+      </w:r>
+      <w:r>
+        <w:rPr>
+          <w:sz w:val="21"/>
+          <w:szCs w:val="21"/>
+        </w:rPr>
+        <w:t xml:space="preserve">Pod mới không lên được, kubectl describe pod báo ImagePullBackOff / ErrImagePull.</w:t>
+      </w:r>
+    </w:p>
+    <w:p>
+      <w:pPr>
+        <w:spacing w:after="100"/>
+        <w:ind w:left="200"/>
+      </w:pPr>
+      <w:r>
+        <w:rPr>
+          <w:b/>
+          <w:bCs/>
+          <w:color w:val="1F5E46"/>
+          <w:sz w:val="21"/>
+          <w:szCs w:val="21"/>
+        </w:rPr>
+        <w:t xml:space="preserve">Nguyên nhân: </w:t>
+      </w:r>
+      <w:r>
+        <w:rPr>
+          <w:sz w:val="21"/>
+          <w:szCs w:val="21"/>
+        </w:rPr>
+        <w:t xml:space="preserve">Bước sed bump tag trong workflow CI ghi sai tên tag (ví dụ thiếu tiền tố backend-), hoặc Docker Hub áp dụng rate limit cho lượt pull ẩn danh của cụm.</w:t>
+      </w:r>
+    </w:p>
+    <w:p>
+      <w:pPr>
+        <w:spacing w:after="100"/>
+        <w:ind w:left="200"/>
+      </w:pPr>
+      <w:r>
+        <w:rPr>
+          <w:b/>
+          <w:bCs/>
+          <w:color w:val="1F5E46"/>
+          <w:sz w:val="21"/>
+          <w:szCs w:val="21"/>
+        </w:rPr>
+        <w:t xml:space="preserve">Cách xử lý chuyên nghiệp: </w:t>
+      </w:r>
+      <w:r>
+        <w:rPr>
+          <w:sz w:val="21"/>
+          <w:szCs w:val="21"/>
+        </w:rPr>
+        <w:t xml:space="preserve">docker pull thủ công đúng tag để tái hiện và xác nhận lỗi; nếu do sai tag, sửa lại workflow và kiểm tra kỹ bước sed bằng cách in ra file YAML trước khi commit; nếu do rate limit, cấu hình imagePullSecrets để pull có xác thực thay vì ẩn danh.</w:t>
+      </w:r>
+    </w:p>
+    <w:p>
+      <w:pPr>
+        <w:spacing w:after="100"/>
+        <w:ind w:left="200"/>
+      </w:pPr>
+      <w:r>
+        <w:rPr>
+          <w:b/>
+          <w:bCs/>
+          <w:color w:val="1F5E46"/>
+          <w:sz w:val="21"/>
+          <w:szCs w:val="21"/>
+        </w:rPr>
+        <w:t xml:space="preserve">Vì sao phải xử lý như vậy: </w:t>
+      </w:r>
+      <w:r>
+        <w:rPr>
+          <w:sz w:val="21"/>
+          <w:szCs w:val="21"/>
+        </w:rPr>
+        <w:t xml:space="preserve">Registry bên thứ ba (Docker Hub) là một external dependency nằm ngoài tầm kiểm soát của hệ thống — một pipeline đáng tin cậy không được để một bước sinh ra dữ liệu (tag) mà không có bước xác minh lại, và một cluster production không nên phụ thuộc vào giới hạn miễn phí của bên ngoài.</w:t>
+      </w:r>
+    </w:p>
+    <w:p>
+      <w:pPr>
+        <w:pStyle w:val="Heading2"/>
+        <w:spacing w:after="120" w:before="300"/>
+      </w:pPr>
+      <w:r>
+        <w:rPr>
+          <w:b/>
+          <w:bCs/>
+          <w:color w:val="C97F12"/>
+          <w:sz w:val="26"/>
+          <w:szCs w:val="26"/>
+        </w:rPr>
+        <w:t xml:space="preserve">Tình huống 4: GitHub Actions chạy hàng loạt workflow liên tiếp không dừng</w:t>
+      </w:r>
+    </w:p>
+    <w:p>
+      <w:pPr>
+        <w:spacing w:after="100"/>
+        <w:ind w:left="200"/>
+      </w:pPr>
+      <w:r>
+        <w:rPr>
+          <w:b/>
+          <w:bCs/>
+          <w:color w:val="1F5E46"/>
+          <w:sz w:val="21"/>
+          <w:szCs w:val="21"/>
+        </w:rPr>
+        <w:t xml:space="preserve">Triệu chứng: </w:t>
+      </w:r>
+      <w:r>
+        <w:rPr>
+          <w:sz w:val="21"/>
+          <w:szCs w:val="21"/>
+        </w:rPr>
+        <w:t xml:space="preserve">Tab Actions hiện hàng chục run kích hoạt liên tục chỉ trong vài phút, dù chỉ có một lần push của lập trình viên.</w:t>
+      </w:r>
+    </w:p>
+    <w:p>
+      <w:pPr>
+        <w:spacing w:after="100"/>
+        <w:ind w:left="200"/>
+      </w:pPr>
+      <w:r>
+        <w:rPr>
+          <w:b/>
+          <w:bCs/>
+          <w:color w:val="1F5E46"/>
+          <w:sz w:val="21"/>
+          <w:szCs w:val="21"/>
+        </w:rPr>
+        <w:t xml:space="preserve">Nguyên nhân: </w:t>
+      </w:r>
+      <w:r>
+        <w:rPr>
+          <w:sz w:val="21"/>
+          <w:szCs w:val="21"/>
+        </w:rPr>
+        <w:t xml:space="preserve">Bước cuối của pipeline tự commit (bump tag ảnh) ngược lại nhánh main — nếu quên loại trừ, chính commit đó lại kích hoạt pipeline một lần nữa, tạo vòng lặp vô hạn.</w:t>
+      </w:r>
+    </w:p>
+    <w:p>
+      <w:pPr>
+        <w:spacing w:after="100"/>
+        <w:ind w:left="200"/>
+      </w:pPr>
+      <w:r>
+        <w:rPr>
+          <w:b/>
+          <w:bCs/>
+          <w:color w:val="1F5E46"/>
+          <w:sz w:val="21"/>
+          <w:szCs w:val="21"/>
+        </w:rPr>
+        <w:t xml:space="preserve">Cách xử lý chuyên nghiệp: </w:t>
+      </w:r>
+      <w:r>
+        <w:rPr>
+          <w:sz w:val="21"/>
+          <w:szCs w:val="21"/>
+        </w:rPr>
+        <w:t xml:space="preserve">Hủy ngay toàn bộ run đang chờ/đang chạy (Cancel workflow) để chặn vòng lặp tốn tài nguyên; xác nhận trigger đã khai báo paths-ignore: [k8s/**, **.md] đúng như thiết kế; với thay đổi tương tự trong tương lai, cân nhắc thêm '[skip ci]' vào message của commit tự động như một lớp phòng vệ thứ hai.</w:t>
+      </w:r>
+    </w:p>
+    <w:p>
+      <w:pPr>
+        <w:spacing w:after="100"/>
+        <w:ind w:left="200"/>
+      </w:pPr>
+      <w:r>
+        <w:rPr>
+          <w:b/>
+          <w:bCs/>
+          <w:color w:val="1F5E46"/>
+          <w:sz w:val="21"/>
+          <w:szCs w:val="21"/>
+        </w:rPr>
+        <w:t xml:space="preserve">Vì sao phải xử lý như vậy: </w:t>
+      </w:r>
+      <w:r>
+        <w:rPr>
+          <w:sz w:val="21"/>
+          <w:szCs w:val="21"/>
+        </w:rPr>
+        <w:t xml:space="preserve">Một pipeline tự nhân bản chính nó là lỗi hệ thống nghiêm trọng vì tiêu tốn tài nguyên CI (và có thể là chi phí) không giới hạn — cần cơ chế 'circuit breaker' để chặn ngay khi phát hiện, không chờ tự hết, đồng thời nguyên nhân gốc phải được vá trước khi push lại bất kỳ thay đổi nào khác.</w:t>
+      </w:r>
+    </w:p>
+    <w:p>
+      <w:pPr>
+        <w:pStyle w:val="Heading2"/>
+        <w:spacing w:after="120" w:before="300"/>
+      </w:pPr>
+      <w:r>
+        <w:rPr>
+          <w:b/>
+          <w:bCs/>
+          <w:color w:val="C97F12"/>
+          <w:sz w:val="26"/>
+          <w:szCs w:val="26"/>
+        </w:rPr>
+        <w:t xml:space="preserve">Tình huống 5: Phát hiện secret thật bị commit nhầm lên GitHub (public repo)</w:t>
+      </w:r>
+    </w:p>
+    <w:p>
+      <w:pPr>
+        <w:spacing w:after="100"/>
+        <w:ind w:left="200"/>
+      </w:pPr>
+      <w:r>
+        <w:rPr>
+          <w:b/>
+          <w:bCs/>
+          <w:color w:val="1F5E46"/>
+          <w:sz w:val="21"/>
+          <w:szCs w:val="21"/>
+        </w:rPr>
+        <w:t xml:space="preserve">Triệu chứng: </w:t>
+      </w:r>
+      <w:r>
+        <w:rPr>
+          <w:sz w:val="21"/>
+          <w:szCs w:val="21"/>
+        </w:rPr>
+        <w:t xml:space="preserve">Một file .env chứa VNP_HASH_SECRET hoặc access token thật vô tình được git add và đã push lên remote.</w:t>
+      </w:r>
+    </w:p>
+    <w:p>
+      <w:pPr>
+        <w:spacing w:after="100"/>
+        <w:ind w:left="200"/>
+      </w:pPr>
+      <w:r>
+        <w:rPr>
+          <w:b/>
+          <w:bCs/>
+          <w:color w:val="1F5E46"/>
+          <w:sz w:val="21"/>
+          <w:szCs w:val="21"/>
+        </w:rPr>
+        <w:t xml:space="preserve">Nguyên nhân: </w:t>
+      </w:r>
+      <w:r>
+        <w:rPr>
+          <w:sz w:val="21"/>
+          <w:szCs w:val="21"/>
+        </w:rPr>
+        <w:t xml:space="preserve">Thao tác git add . theo thói quen mà không rà soát lại git status/diff trước khi commit.</w:t>
+      </w:r>
+    </w:p>
+    <w:p>
+      <w:pPr>
+        <w:spacing w:after="100"/>
+        <w:ind w:left="200"/>
+      </w:pPr>
+      <w:r>
+        <w:rPr>
+          <w:b/>
+          <w:bCs/>
+          <w:color w:val="1F5E46"/>
+          <w:sz w:val="21"/>
+          <w:szCs w:val="21"/>
+        </w:rPr>
+        <w:t xml:space="preserve">Cách xử lý chuyên nghiệp: </w:t>
+      </w:r>
+      <w:r>
+        <w:rPr>
+          <w:sz w:val="21"/>
+          <w:szCs w:val="21"/>
+        </w:rPr>
+        <w:t xml:space="preserve">Xoay vòng (rotate) secret đó ngay lập tức tại nguồn — tạo VNP_HashSecret mới ở VNPay, tạo Docker Hub token mới — trước khi làm bất cứ điều gì khác; sau đó dùng git filter-repo (hoặc BFG Repo-Cleaner) để xóa khỏi toàn bộ lịch sử Git, force-push, và thông báo cho các thành viên khác pull lại từ đầu.</w:t>
+      </w:r>
+    </w:p>
+    <w:p>
+      <w:pPr>
+        <w:spacing w:after="100"/>
+        <w:ind w:left="200"/>
+      </w:pPr>
+      <w:r>
+        <w:rPr>
+          <w:b/>
+          <w:bCs/>
+          <w:color w:val="1F5E46"/>
+          <w:sz w:val="21"/>
+          <w:szCs w:val="21"/>
+        </w:rPr>
+        <w:t xml:space="preserve">Vì sao phải xử lý như vậy: </w:t>
+      </w:r>
+      <w:r>
+        <w:rPr>
+          <w:sz w:val="21"/>
+          <w:szCs w:val="21"/>
+        </w:rPr>
+        <w:t xml:space="preserve">Chỉ xóa file ở commit mới (git rm) là không đủ vì secret vẫn tồn tại trong lịch sử Git và repo public có thể đã bị bot quét/crawl trong vài giây sau khi push — nguyên tắc bắt buộc là secret coi như đã lộ ngay khi push công khai, việc dọn lịch sử chỉ là dọn dẹp, rotate mới là hành động khắc phục thật sự.</w:t>
+      </w:r>
+    </w:p>
+    <w:p>
+      <w:pPr>
+        <w:pStyle w:val="Heading2"/>
+        <w:spacing w:after="120" w:before="300"/>
+      </w:pPr>
+      <w:r>
+        <w:rPr>
+          <w:b/>
+          <w:bCs/>
+          <w:color w:val="C97F12"/>
+          <w:sz w:val="26"/>
+          <w:szCs w:val="26"/>
+        </w:rPr>
+        <w:t xml:space="preserve">Tình huống 6: Rolling update gây gián đoạn ngắn — một số request trả 502/504</w:t>
+      </w:r>
+    </w:p>
+    <w:p>
+      <w:pPr>
+        <w:spacing w:after="100"/>
+        <w:ind w:left="200"/>
+      </w:pPr>
+      <w:r>
+        <w:rPr>
+          <w:b/>
+          <w:bCs/>
+          <w:color w:val="1F5E46"/>
+          <w:sz w:val="21"/>
+          <w:szCs w:val="21"/>
+        </w:rPr>
+        <w:t xml:space="preserve">Triệu chứng: </w:t>
+      </w:r>
+      <w:r>
+        <w:rPr>
+          <w:sz w:val="21"/>
+          <w:szCs w:val="21"/>
+        </w:rPr>
+        <w:t xml:space="preserve">Trong vài giây khi deploy phiên bản backend mới, một phần request từ frontend nhận lỗi 502 Bad Gateway.</w:t>
+      </w:r>
+    </w:p>
+    <w:p>
+      <w:pPr>
+        <w:spacing w:after="100"/>
+        <w:ind w:left="200"/>
+      </w:pPr>
+      <w:r>
+        <w:rPr>
+          <w:b/>
+          <w:bCs/>
+          <w:color w:val="1F5E46"/>
+          <w:sz w:val="21"/>
+          <w:szCs w:val="21"/>
+        </w:rPr>
+        <w:t xml:space="preserve">Nguyên nhân: </w:t>
+      </w:r>
+      <w:r>
+        <w:rPr>
+          <w:sz w:val="21"/>
+          <w:szCs w:val="21"/>
+        </w:rPr>
+        <w:t xml:space="preserve">Chưa cấu hình readinessProbe cho Deployment backend — Kubernetes coi Pod 'sẵn sàng' ngay khi container start, trong khi Express/Prisma còn đang kết nối database, nên Service đã route traffic vào Pod chưa thực sự xử lý được request.</w:t>
+      </w:r>
+    </w:p>
+    <w:p>
+      <w:pPr>
+        <w:spacing w:after="100"/>
+        <w:ind w:left="200"/>
+      </w:pPr>
+      <w:r>
+        <w:rPr>
+          <w:b/>
+          <w:bCs/>
+          <w:color w:val="1F5E46"/>
+          <w:sz w:val="21"/>
+          <w:szCs w:val="21"/>
+        </w:rPr>
+        <w:t xml:space="preserve">Cách xử lý chuyên nghiệp: </w:t>
+      </w:r>
+      <w:r>
+        <w:rPr>
+          <w:sz w:val="21"/>
+          <w:szCs w:val="21"/>
+        </w:rPr>
+        <w:t xml:space="preserve">Thêm readinessProbe (httpGet /api/health) với initialDelaySeconds và periodSeconds phù hợp vào backend-deployment.yaml, đảm bảo Service chỉ đưa traffic vào Pod khi đã pass probe; kết hợp maxUnavailable: 0 trong rolling update strategy để không tắt Pod cũ trước khi Pod mới thật sự sẵn sàng.</w:t>
+      </w:r>
+    </w:p>
+    <w:p>
+      <w:pPr>
+        <w:spacing w:after="100"/>
+        <w:ind w:left="200"/>
+      </w:pPr>
+      <w:r>
+        <w:rPr>
+          <w:b/>
+          <w:bCs/>
+          <w:color w:val="1F5E46"/>
+          <w:sz w:val="21"/>
+          <w:szCs w:val="21"/>
+        </w:rPr>
+        <w:t xml:space="preserve">Vì sao phải xử lý như vậy: </w:t>
+      </w:r>
+      <w:r>
+        <w:rPr>
+          <w:sz w:val="21"/>
+          <w:szCs w:val="21"/>
+        </w:rPr>
+        <w:t xml:space="preserve">Đây đúng là lý do Readiness Probe tồn tại tách biệt với Liveness Probe: liveness trả lời 'container còn sống không', readiness trả lời 'container đã sẵn sàng phục vụ chưa' — thiếu readiness probe là nguyên nhân phổ biến nhất gây downtime ngắn trong rolling update tưởng chừng 'zero-downtime'.</w:t>
+      </w:r>
+    </w:p>
+    <w:p>
+      <w:pPr>
+        <w:pStyle w:val="Heading2"/>
+        <w:spacing w:after="120" w:before="300"/>
+      </w:pPr>
+      <w:r>
+        <w:rPr>
+          <w:b/>
+          <w:bCs/>
+          <w:color w:val="C97F12"/>
+          <w:sz w:val="26"/>
+          <w:szCs w:val="26"/>
+        </w:rPr>
+        <w:t xml:space="preserve">Tình huống 7: Database migration làm hỏng schema giữa chừng khi deploy</w:t>
+      </w:r>
+    </w:p>
+    <w:p>
+      <w:pPr>
+        <w:spacing w:after="100"/>
+        <w:ind w:left="200"/>
+      </w:pPr>
+      <w:r>
+        <w:rPr>
+          <w:b/>
+          <w:bCs/>
+          <w:color w:val="1F5E46"/>
+          <w:sz w:val="21"/>
+          <w:szCs w:val="21"/>
+        </w:rPr>
+        <w:t xml:space="preserve">Triệu chứng: </w:t>
+      </w:r>
+      <w:r>
+        <w:rPr>
+          <w:sz w:val="21"/>
+          <w:szCs w:val="21"/>
+        </w:rPr>
+        <w:t xml:space="preserve">Sau khi rollout xong, backend báo lỗi 'column does not exist'; một số request thành công, một số lỗi tùy vào Pod nào xử lý.</w:t>
+      </w:r>
+    </w:p>
+    <w:p>
+      <w:pPr>
+        <w:spacing w:after="100"/>
+        <w:ind w:left="200"/>
+      </w:pPr>
+      <w:r>
+        <w:rPr>
+          <w:b/>
+          <w:bCs/>
+          <w:color w:val="1F5E46"/>
+          <w:sz w:val="21"/>
+          <w:szCs w:val="21"/>
+        </w:rPr>
+        <w:t xml:space="preserve">Nguyên nhân: </w:t>
+      </w:r>
+      <w:r>
+        <w:rPr>
+          <w:sz w:val="21"/>
+          <w:szCs w:val="21"/>
+        </w:rPr>
+        <w:t xml:space="preserve">Cả 2 Pod backend replica cùng chạy npx prisma migrate deploy khi container start (đúng như CMD hiện tại trong Dockerfile), có thể xảy ra race condition; nghiêm trọng hơn nếu migration là 'breaking change' (xóa/đổi tên cột) thì Pod cũ (đang được thay thế dần trong rolling update) vẫn đọc theo schema cũ và lỗi ngay lập tức.</w:t>
+      </w:r>
+    </w:p>
+    <w:p>
+      <w:pPr>
+        <w:spacing w:after="100"/>
+        <w:ind w:left="200"/>
+      </w:pPr>
+      <w:r>
+        <w:rPr>
+          <w:b/>
+          <w:bCs/>
+          <w:color w:val="1F5E46"/>
+          <w:sz w:val="21"/>
+          <w:szCs w:val="21"/>
+        </w:rPr>
+        <w:t xml:space="preserve">Cách xử lý chuyên nghiệp: </w:t>
+      </w:r>
+      <w:r>
+        <w:rPr>
+          <w:sz w:val="21"/>
+          <w:szCs w:val="21"/>
+        </w:rPr>
+        <w:t xml:space="preserve">Tách bước migrate deploy ra khỏi CMD của container ứng dụng, chạy bằng một Kubernetes Job riêng (chạy đúng 1 lần, trước khi rollout Deployment, ví dụ qua Argo CD PreSync hook); với thay đổi schema có tính phá vỡ, áp dụng chiến lược 'expand-contract': thêm cột mới ở lần deploy này (code đọc được cả cột cũ lẫn mới), rồi mới xóa cột cũ ở một lần deploy sau.</w:t>
+      </w:r>
+    </w:p>
+    <w:p>
+      <w:pPr>
+        <w:spacing w:after="100"/>
+        <w:ind w:left="200"/>
+      </w:pPr>
+      <w:r>
+        <w:rPr>
+          <w:b/>
+          <w:bCs/>
+          <w:color w:val="1F5E46"/>
+          <w:sz w:val="21"/>
+          <w:szCs w:val="21"/>
+        </w:rPr>
+        <w:t xml:space="preserve">Vì sao phải xử lý như vậy: </w:t>
+      </w:r>
+      <w:r>
+        <w:rPr>
+          <w:sz w:val="21"/>
+          <w:szCs w:val="21"/>
+        </w:rPr>
+        <w:t xml:space="preserve">Chạy migration đồng thời từ nhiều replica là race condition kinh điển, còn migration 'breaking' trong lúc rolling update chắc chắn có một khoảng thời gian 2 phiên bản code cùng chạy song song trên cùng 1 schema — 'expand-contract' là cách tiêu chuẩn để đảm bảo cả phiên bản cũ và mới đều hoạt động được trong khoảng chuyển tiếp đó.</w:t>
+      </w:r>
+    </w:p>
+    <w:p>
+      <w:pPr>
+        <w:pStyle w:val="Heading2"/>
+        <w:spacing w:after="120" w:before="300"/>
+      </w:pPr>
+      <w:r>
+        <w:rPr>
+          <w:b/>
+          <w:bCs/>
+          <w:color w:val="C97F12"/>
+          <w:sz w:val="26"/>
+          <w:szCs w:val="26"/>
+        </w:rPr>
+        <w:t xml:space="preserve">Tình huống 8: Thanh toán VNPay báo lỗi 'sai chữ ký' (invalid signature) hàng loạt</w:t>
+      </w:r>
+    </w:p>
+    <w:p>
+      <w:pPr>
+        <w:spacing w:after="100"/>
+        <w:ind w:left="200"/>
+      </w:pPr>
+      <w:r>
+        <w:rPr>
+          <w:b/>
+          <w:bCs/>
+          <w:color w:val="1F5E46"/>
+          <w:sz w:val="21"/>
+          <w:szCs w:val="21"/>
+        </w:rPr>
+        <w:t xml:space="preserve">Triệu chứng: </w:t>
+      </w:r>
+      <w:r>
+        <w:rPr>
+          <w:sz w:val="21"/>
+          <w:szCs w:val="21"/>
+        </w:rPr>
+        <w:t xml:space="preserve">Toàn bộ giao dịch sau một lần deploy đều bị VNPay từ chối với lỗi checksum không khớp, dù trước đó thanh toán vẫn hoạt động bình thường.</w:t>
+      </w:r>
+    </w:p>
+    <w:p>
+      <w:pPr>
+        <w:spacing w:after="100"/>
+        <w:ind w:left="200"/>
+      </w:pPr>
+      <w:r>
+        <w:rPr>
+          <w:b/>
+          <w:bCs/>
+          <w:color w:val="1F5E46"/>
+          <w:sz w:val="21"/>
+          <w:szCs w:val="21"/>
+        </w:rPr>
+        <w:t xml:space="preserve">Nguyên nhân: </w:t>
+      </w:r>
+      <w:r>
+        <w:rPr>
+          <w:sz w:val="21"/>
+          <w:szCs w:val="21"/>
+        </w:rPr>
+        <w:t xml:space="preserve">Giá trị VNP_HASH_SECRET trong Kubernetes Secret không khớp với secret đã đăng ký trên cổng sandbox VNPay — thường xảy ra khi rotate secret (như tình huống 5) ở phía hệ thống mình nhưng quên cập nhật lại trên VNPay, hoặc deploy nhầm Secret của môi trường khác.</w:t>
+      </w:r>
+    </w:p>
+    <w:p>
+      <w:pPr>
+        <w:spacing w:after="100"/>
+        <w:ind w:left="200"/>
+      </w:pPr>
+      <w:r>
+        <w:rPr>
+          <w:b/>
+          <w:bCs/>
+          <w:color w:val="1F5E46"/>
+          <w:sz w:val="21"/>
+          <w:szCs w:val="21"/>
+        </w:rPr>
+        <w:t xml:space="preserve">Cách xử lý chuyên nghiệp: </w:t>
+      </w:r>
+      <w:r>
+        <w:rPr>
+          <w:sz w:val="21"/>
+          <w:szCs w:val="21"/>
+        </w:rPr>
+        <w:t xml:space="preserve">Kiểm tra qua log backend (chỉ log độ dài/hash rút gọn để so sánh, không log secret thật ra log tập trung); đối chiếu chính xác vnp_TmnCode và vnp_HashSecret giữa 2 phía; dùng kubectl get secret backend-secret -n ecommerce -o yaml kết hợp base64 -d để xác nhận giá trị đang chạy thật trên cluster đúng như kỳ vọng.</w:t>
+      </w:r>
+    </w:p>
+    <w:p>
+      <w:pPr>
+        <w:spacing w:after="100"/>
+        <w:ind w:left="200"/>
+      </w:pPr>
+      <w:r>
+        <w:rPr>
+          <w:b/>
+          <w:bCs/>
+          <w:color w:val="1F5E46"/>
+          <w:sz w:val="21"/>
+          <w:szCs w:val="21"/>
+        </w:rPr>
+        <w:t xml:space="preserve">Vì sao phải xử lý như vậy: </w:t>
+      </w:r>
+      <w:r>
+        <w:rPr>
+          <w:sz w:val="21"/>
+          <w:szCs w:val="21"/>
+        </w:rPr>
+        <w:t xml:space="preserve">Đây là minh họa rủi ro khi một thông tin nhạy cảm tồn tại đồng thời ở 2 hệ thống độc lập (hệ thống mình và đối tác thanh toán) — bất kỳ lần rotate secret nào cũng phải đồng bộ ở cả hai phía theo một runbook rõ ràng, không dựa vào trí nhớ, vì lỗi kiểu này thường chỉ được phát hiện khi khách hàng thật đã gặp lỗi thanh toán.</w:t>
+      </w:r>
+    </w:p>
+    <w:p>
+      <w:pPr>
+        <w:pStyle w:val="Heading2"/>
+        <w:spacing w:after="120" w:before="300"/>
+      </w:pPr>
+      <w:r>
+        <w:rPr>
+          <w:b/>
+          <w:bCs/>
+          <w:color w:val="C97F12"/>
+          <w:sz w:val="26"/>
+          <w:szCs w:val="26"/>
+        </w:rPr>
+        <w:t xml:space="preserve">Tình huống 9: Docker Desktop / máy tính khởi động lại đột ngột làm toàn bộ Pod restart</w:t>
+      </w:r>
+    </w:p>
+    <w:p>
+      <w:pPr>
+        <w:spacing w:after="100"/>
+        <w:ind w:left="200"/>
+      </w:pPr>
+      <w:r>
+        <w:rPr>
+          <w:b/>
+          <w:bCs/>
+          <w:color w:val="1F5E46"/>
+          <w:sz w:val="21"/>
+          <w:szCs w:val="21"/>
+        </w:rPr>
+        <w:t xml:space="preserve">Triệu chứng: </w:t>
+      </w:r>
+      <w:r>
+        <w:rPr>
+          <w:sz w:val="21"/>
+          <w:szCs w:val="21"/>
+        </w:rPr>
+        <w:t xml:space="preserve">Sau khi mở lại máy (mất điện, máy ngủ đông, Docker Desktop tự khởi động lại), kubectl get pods cho thấy toàn bộ Pod có RESTARTS tăng và AGE reset.</w:t>
+      </w:r>
+    </w:p>
+    <w:p>
+      <w:pPr>
+        <w:spacing w:after="100"/>
+        <w:ind w:left="200"/>
+      </w:pPr>
+      <w:r>
+        <w:rPr>
+          <w:b/>
+          <w:bCs/>
+          <w:color w:val="1F5E46"/>
+          <w:sz w:val="21"/>
+          <w:szCs w:val="21"/>
+        </w:rPr>
+        <w:t xml:space="preserve">Nguyên nhân: </w:t>
+      </w:r>
+      <w:r>
+        <w:rPr>
+          <w:sz w:val="21"/>
+          <w:szCs w:val="21"/>
+        </w:rPr>
+        <w:t xml:space="preserve">Docker Desktop dừng toàn bộ container khi máy tắt/ngủ; khi khởi động lại, container runtime khởi động lại từ đầu, kubelet phát hiện các Pod đã khai báo trong Deployment/StatefulSet chưa chạy nên tự tạo lại.</w:t>
+      </w:r>
+    </w:p>
+    <w:p>
+      <w:pPr>
+        <w:spacing w:after="100"/>
+        <w:ind w:left="200"/>
+      </w:pPr>
+      <w:r>
+        <w:rPr>
+          <w:b/>
+          <w:bCs/>
+          <w:color w:val="1F5E46"/>
+          <w:sz w:val="21"/>
+          <w:szCs w:val="21"/>
+        </w:rPr>
+        <w:t xml:space="preserve">Cách xử lý chuyên nghiệp: </w:t>
+      </w:r>
+      <w:r>
+        <w:rPr>
+          <w:sz w:val="21"/>
+          <w:szCs w:val="21"/>
+        </w:rPr>
+        <w:t xml:space="preserve">Không cần can thiệp thủ công để 'dựng lại hệ thống' — chỉ cần xác minh: kubectl get pods,pvc -n ecommerce (đều Running/Bound), curl qua Ingress trả 200, kubectl get application -n argocd vẫn Synced/Healthy. Việc của DevOps lúc này là xác minh, không phải build lại.</w:t>
+      </w:r>
+    </w:p>
+    <w:p>
+      <w:pPr>
+        <w:spacing w:after="100"/>
+        <w:ind w:left="200"/>
+      </w:pPr>
+      <w:r>
+        <w:rPr>
+          <w:b/>
+          <w:bCs/>
+          <w:color w:val="1F5E46"/>
+          <w:sz w:val="21"/>
+          <w:szCs w:val="21"/>
+        </w:rPr>
+        <w:t xml:space="preserve">Vì sao phải xử lý như vậy: </w:t>
+      </w:r>
+      <w:r>
+        <w:rPr>
+          <w:sz w:val="21"/>
+          <w:szCs w:val="21"/>
+        </w:rPr>
+        <w:t xml:space="preserve">Đây là minh chứng thực tế cho nguyên tắc self-healing và thiết kế Pod không trạng thái (stateless): hạ tầng được khai báo đúng (Deployment, StatefulSet, PVC tách rời vòng đời Pod) sẽ tự phục hồi hoàn toàn sau sự cố hạ tầng bên dưới, dữ liệu Postgres không mất vì PVC không phụ thuộc vòng đời Pod — đúng lý do PVC được dùng thay vì lưu dữ liệu trong container.</w:t>
+      </w:r>
+    </w:p>
+    <w:p>
+      <w:pPr>
+        <w:pStyle w:val="Heading2"/>
+        <w:spacing w:after="120" w:before="300"/>
+      </w:pPr>
+      <w:r>
+        <w:rPr>
+          <w:b/>
+          <w:bCs/>
+          <w:color w:val="C97F12"/>
+          <w:sz w:val="26"/>
+          <w:szCs w:val="26"/>
+        </w:rPr>
+        <w:t xml:space="preserve">Tình huống 10: ArgoCD liên tục báo OutOfSync dù không ai chỉnh sửa gì trong Git</w:t>
+      </w:r>
+    </w:p>
+    <w:p>
+      <w:pPr>
+        <w:spacing w:after="100"/>
+        <w:ind w:left="200"/>
+      </w:pPr>
+      <w:r>
+        <w:rPr>
+          <w:b/>
+          <w:bCs/>
+          <w:color w:val="1F5E46"/>
+          <w:sz w:val="21"/>
+          <w:szCs w:val="21"/>
+        </w:rPr>
+        <w:t xml:space="preserve">Triệu chứng: </w:t>
+      </w:r>
+      <w:r>
+        <w:rPr>
+          <w:sz w:val="21"/>
+          <w:szCs w:val="21"/>
+        </w:rPr>
+        <w:t xml:space="preserve">Application status dao động qua lại giữa Synced và OutOfSync mỗi vài phút, dù lịch sử Git không có commit mới nào trong khoảng thời gian đó.</w:t>
+      </w:r>
+    </w:p>
+    <w:p>
+      <w:pPr>
+        <w:spacing w:after="100"/>
+        <w:ind w:left="200"/>
+      </w:pPr>
+      <w:r>
+        <w:rPr>
+          <w:b/>
+          <w:bCs/>
+          <w:color w:val="1F5E46"/>
+          <w:sz w:val="21"/>
+          <w:szCs w:val="21"/>
+        </w:rPr>
+        <w:t xml:space="preserve">Nguyên nhân: </w:t>
+      </w:r>
+      <w:r>
+        <w:rPr>
+          <w:sz w:val="21"/>
+          <w:szCs w:val="21"/>
+        </w:rPr>
+        <w:t xml:space="preserve">Một tác nhân khác trong cluster (ví dụ HorizontalPodAutoscaler, hoặc chính Kubernetes ghi thêm field mặc định) tự động thay đổi một trường như spec.replicas — ArgoCD phát hiện lệch so với Git, tự sync lại, rồi tác nhân kia lại đổi tiếp, tạo vòng giành quyền kiểm soát (fight) giữa 2 controller.</w:t>
+      </w:r>
+    </w:p>
+    <w:p>
+      <w:pPr>
+        <w:spacing w:after="100"/>
+        <w:ind w:left="200"/>
+      </w:pPr>
+      <w:r>
+        <w:rPr>
+          <w:b/>
+          <w:bCs/>
+          <w:color w:val="1F5E46"/>
+          <w:sz w:val="21"/>
+          <w:szCs w:val="21"/>
+        </w:rPr>
+        <w:t xml:space="preserve">Cách xử lý chuyên nghiệp: </w:t>
+      </w:r>
+      <w:r>
+        <w:rPr>
+          <w:sz w:val="21"/>
+          <w:szCs w:val="21"/>
+        </w:rPr>
+        <w:t xml:space="preserve">Khai báo ignoreDifferences trong Application CRD cho đúng field đang được một controller khác quản lý hợp lệ (ví dụ bỏ qua spec.replicas nếu có HPA), thay vì để ArgoCD ép field đó về đúng số trong Git mỗi lần.</w:t>
+      </w:r>
+    </w:p>
+    <w:p>
+      <w:pPr>
+        <w:spacing w:after="100"/>
+        <w:ind w:left="200"/>
+      </w:pPr>
+      <w:r>
+        <w:rPr>
+          <w:b/>
+          <w:bCs/>
+          <w:color w:val="1F5E46"/>
+          <w:sz w:val="21"/>
+          <w:szCs w:val="21"/>
+        </w:rPr>
+        <w:t xml:space="preserve">Vì sao phải xử lý như vậy: </w:t>
+      </w:r>
+      <w:r>
+        <w:rPr>
+          <w:sz w:val="21"/>
+          <w:szCs w:val="21"/>
+        </w:rPr>
+        <w:t xml:space="preserve">Nguyên tắc GitOps chỉ hoạt động đúng khi mỗi field có đúng MỘT chủ sở hữu rõ ràng — khi hai hệ thống tự động cùng muốn quyết định một giá trị, phải khai báo tường minh ai được quyền thắng, nếu không sẽ sinh ra vòng đồng bộ vô ích, gây nhiễu tín hiệu giám sát thật (không phân biệt được đâu là OutOfSync thật cần chú ý, đâu là do xung đột 2 controller).</w:t>
+      </w:r>
+    </w:p>
+    <w:p>
+      <w:r>
+        <w:br w:type="page"/>
+      </w:r>
+    </w:p>
+    <w:p>
+      <w:pPr>
+        <w:pStyle w:val="Heading1"/>
+        <w:spacing w:after="200" w:before="400"/>
+      </w:pPr>
+      <w:r>
+        <w:t xml:space="preserve">9. Thông tin truy cập nhanh</w:t>
       </w:r>
     </w:p>
     <w:tbl>

</xml_diff>